<commit_message>
Pushing the version with github link and screenshoots
</commit_message>
<xml_diff>
--- a/module-1/Guadron-Assignment1_2.docx
+++ b/module-1/Guadron-Assignment1_2.docx
@@ -29,17 +29,19 @@
           <w14:ligatures w14:val="none"/>
         </w:rPr>
         <w:br/>
-        <w:t xml:space="preserve">Date: </w:t>
+        <w:t>Date: 10/24/2026</w:t>
       </w:r>
-      <w:r>
+    </w:p>
+    <w:p>
+      <w:pPr>
+        <w:spacing w:after="0" w:line="240" w:lineRule="auto"/>
         <w:rPr>
           <w:rFonts w:ascii="Times New Roman" w:eastAsia="Times New Roman" w:hAnsi="Times New Roman" w:cs="Times New Roman"/>
           <w:color w:val="000000" w:themeColor="text1"/>
           <w:kern w:val="0"/>
           <w14:ligatures w14:val="none"/>
         </w:rPr>
-        <w:t>10</w:t>
-      </w:r>
+      </w:pPr>
       <w:r>
         <w:rPr>
           <w:rFonts w:ascii="Times New Roman" w:eastAsia="Times New Roman" w:hAnsi="Times New Roman" w:cs="Times New Roman"/>
@@ -47,26 +49,30 @@
           <w:kern w:val="0"/>
           <w14:ligatures w14:val="none"/>
         </w:rPr>
-        <w:t>/</w:t>
+        <w:t>Module 1.2 Assignment – GitHub Repository Setup</w:t>
       </w:r>
-      <w:r>
+    </w:p>
+    <w:p>
+      <w:pPr>
+        <w:spacing w:after="0" w:line="240" w:lineRule="auto"/>
         <w:rPr>
           <w:rFonts w:ascii="Times New Roman" w:eastAsia="Times New Roman" w:hAnsi="Times New Roman" w:cs="Times New Roman"/>
           <w:color w:val="000000" w:themeColor="text1"/>
           <w:kern w:val="0"/>
           <w14:ligatures w14:val="none"/>
         </w:rPr>
-        <w:t>24</w:t>
-      </w:r>
-      <w:r>
+      </w:pPr>
+    </w:p>
+    <w:p>
+      <w:pPr>
+        <w:spacing w:after="0" w:line="240" w:lineRule="auto"/>
         <w:rPr>
           <w:rFonts w:ascii="Times New Roman" w:eastAsia="Times New Roman" w:hAnsi="Times New Roman" w:cs="Times New Roman"/>
           <w:color w:val="000000" w:themeColor="text1"/>
           <w:kern w:val="0"/>
           <w14:ligatures w14:val="none"/>
         </w:rPr>
-        <w:t>/2026</w:t>
-      </w:r>
+      </w:pPr>
     </w:p>
     <w:p>
       <w:pPr>
@@ -78,15 +84,18 @@
           <w14:ligatures w14:val="none"/>
         </w:rPr>
       </w:pPr>
-      <w:r>
+    </w:p>
+    <w:p>
+      <w:pPr>
+        <w:shd w:val="clear" w:color="auto" w:fill="FFFFFF"/>
+        <w:spacing w:after="0" w:line="240" w:lineRule="auto"/>
         <w:rPr>
           <w:rFonts w:ascii="Times New Roman" w:eastAsia="Times New Roman" w:hAnsi="Times New Roman" w:cs="Times New Roman"/>
           <w:color w:val="000000" w:themeColor="text1"/>
           <w:kern w:val="0"/>
           <w14:ligatures w14:val="none"/>
         </w:rPr>
-        <w:t xml:space="preserve">Module </w:t>
-      </w:r>
+      </w:pPr>
       <w:r>
         <w:rPr>
           <w:rFonts w:ascii="Times New Roman" w:eastAsia="Times New Roman" w:hAnsi="Times New Roman" w:cs="Times New Roman"/>
@@ -94,7 +103,7 @@
           <w:kern w:val="0"/>
           <w14:ligatures w14:val="none"/>
         </w:rPr>
-        <w:t>1</w:t>
+        <w:t xml:space="preserve">1 - </w:t>
       </w:r>
       <w:r>
         <w:rPr>
@@ -103,17 +112,19 @@
           <w:kern w:val="0"/>
           <w14:ligatures w14:val="none"/>
         </w:rPr>
-        <w:t xml:space="preserve">.2 Assignment – </w:t>
+        <w:t>Link to your GitHub repository - https://github.com/bguadron1717/csd-310</w:t>
       </w:r>
-      <w:r>
+    </w:p>
+    <w:p>
+      <w:pPr>
+        <w:spacing w:after="0" w:line="240" w:lineRule="auto"/>
         <w:rPr>
           <w:rFonts w:ascii="Times New Roman" w:eastAsia="Times New Roman" w:hAnsi="Times New Roman" w:cs="Times New Roman"/>
           <w:color w:val="000000" w:themeColor="text1"/>
           <w:kern w:val="0"/>
           <w14:ligatures w14:val="none"/>
         </w:rPr>
-        <w:t>GitHub Repository Setup</w:t>
-      </w:r>
+      </w:pPr>
     </w:p>
     <w:p>
       <w:pPr>
@@ -136,52 +147,45 @@
           <w14:ligatures w14:val="none"/>
         </w:rPr>
       </w:pPr>
-    </w:p>
-    <w:p>
-      <w:pPr>
-        <w:spacing w:after="0" w:line="240" w:lineRule="auto"/>
+      <w:r>
         <w:rPr>
           <w:rFonts w:ascii="Times New Roman" w:eastAsia="Times New Roman" w:hAnsi="Times New Roman" w:cs="Times New Roman"/>
           <w:color w:val="000000" w:themeColor="text1"/>
           <w:kern w:val="0"/>
           <w14:ligatures w14:val="none"/>
         </w:rPr>
-      </w:pPr>
-    </w:p>
-    <w:p>
-      <w:pPr>
-        <w:spacing w:after="0" w:line="240" w:lineRule="auto"/>
+        <w:t>Terminal Screenshot</w:t>
+      </w:r>
+      <w:r>
         <w:rPr>
           <w:rFonts w:ascii="Times New Roman" w:eastAsia="Times New Roman" w:hAnsi="Times New Roman" w:cs="Times New Roman"/>
           <w:color w:val="000000" w:themeColor="text1"/>
           <w:kern w:val="0"/>
           <w14:ligatures w14:val="none"/>
         </w:rPr>
-      </w:pPr>
-      <w:r>
+        <w:t xml:space="preserve"> showing directory and module 1</w:t>
+      </w:r>
+    </w:p>
+    <w:p>
+      <w:pPr>
+        <w:spacing w:after="0" w:line="240" w:lineRule="auto"/>
         <w:rPr>
           <w:rFonts w:ascii="Times New Roman" w:eastAsia="Times New Roman" w:hAnsi="Times New Roman" w:cs="Times New Roman"/>
           <w:color w:val="000000" w:themeColor="text1"/>
           <w:kern w:val="0"/>
           <w14:ligatures w14:val="none"/>
         </w:rPr>
-        <w:t>Terminal Screenshot</w:t>
-      </w:r>
+      </w:pPr>
     </w:p>
     <w:p>
       <w:pPr>
-        <w:spacing w:after="0" w:line="240" w:lineRule="auto"/>
-        <w:rPr>
-          <w:rFonts w:ascii="Times New Roman" w:eastAsia="Times New Roman" w:hAnsi="Times New Roman" w:cs="Times New Roman"/>
-          <w:color w:val="000000" w:themeColor="text1"/>
-          <w:kern w:val="0"/>
-          <w14:ligatures w14:val="none"/>
-        </w:rPr>
-      </w:pPr>
-    </w:p>
-    <w:p>
+        <w:rPr>
+          <w:rFonts w:ascii="Times New Roman" w:hAnsi="Times New Roman" w:cs="Times New Roman"/>
+        </w:rPr>
+      </w:pPr>
       <w:r>
         <w:rPr>
+          <w:rFonts w:ascii="Times New Roman" w:hAnsi="Times New Roman" w:cs="Times New Roman"/>
           <w:noProof/>
         </w:rPr>
         <w:drawing>
@@ -200,7 +204,7 @@
                     <pic:cNvPicPr/>
                   </pic:nvPicPr>
                   <pic:blipFill>
-                    <a:blip r:embed="rId4">
+                    <a:blip r:embed="rId5">
                       <a:extLst>
                         <a:ext uri="{28A0092B-C50C-407E-A947-70E740481C1C}">
                           <a14:useLocalDpi xmlns:a14="http://schemas.microsoft.com/office/drawing/2010/main" val="0"/>
@@ -227,6 +231,114 @@
         </w:drawing>
       </w:r>
     </w:p>
+    <w:p>
+      <w:pPr>
+        <w:rPr>
+          <w:rFonts w:ascii="Times New Roman" w:hAnsi="Times New Roman" w:cs="Times New Roman"/>
+        </w:rPr>
+      </w:pPr>
+    </w:p>
+    <w:p>
+      <w:pPr>
+        <w:rPr>
+          <w:rFonts w:ascii="Times New Roman" w:hAnsi="Times New Roman" w:cs="Times New Roman"/>
+        </w:rPr>
+      </w:pPr>
+    </w:p>
+    <w:p>
+      <w:pPr>
+        <w:rPr>
+          <w:rFonts w:ascii="Times New Roman" w:hAnsi="Times New Roman" w:cs="Times New Roman"/>
+        </w:rPr>
+      </w:pPr>
+    </w:p>
+    <w:p>
+      <w:pPr>
+        <w:rPr>
+          <w:rFonts w:ascii="Times New Roman" w:hAnsi="Times New Roman" w:cs="Times New Roman"/>
+        </w:rPr>
+      </w:pPr>
+    </w:p>
+    <w:p>
+      <w:pPr>
+        <w:rPr>
+          <w:rFonts w:ascii="Times New Roman" w:hAnsi="Times New Roman" w:cs="Times New Roman"/>
+        </w:rPr>
+      </w:pPr>
+    </w:p>
+    <w:p>
+      <w:pPr>
+        <w:rPr>
+          <w:rFonts w:ascii="Times New Roman" w:hAnsi="Times New Roman" w:cs="Times New Roman"/>
+        </w:rPr>
+      </w:pPr>
+      <w:r>
+        <w:rPr>
+          <w:rFonts w:ascii="Times New Roman" w:hAnsi="Times New Roman" w:cs="Times New Roman"/>
+        </w:rPr>
+        <w:t>GitHub’s screenshot repository showing the committed and pushed document</w:t>
+      </w:r>
+    </w:p>
+    <w:p>
+      <w:pPr>
+        <w:rPr>
+          <w:rFonts w:ascii="Times New Roman" w:hAnsi="Times New Roman" w:cs="Times New Roman"/>
+        </w:rPr>
+      </w:pPr>
+      <w:r>
+        <w:rPr>
+          <w:rFonts w:ascii="Times New Roman" w:hAnsi="Times New Roman" w:cs="Times New Roman"/>
+          <w:noProof/>
+        </w:rPr>
+        <w:drawing>
+          <wp:inline distT="0" distB="0" distL="0" distR="0" wp14:anchorId="06146E3C" wp14:editId="4E412951">
+            <wp:extent cx="5943600" cy="3232785"/>
+            <wp:effectExtent l="0" t="0" r="0" b="5715"/>
+            <wp:docPr id="2140321094" name="Picture 2"/>
+            <wp:cNvGraphicFramePr>
+              <a:graphicFrameLocks xmlns:a="http://schemas.openxmlformats.org/drawingml/2006/main" noChangeAspect="1"/>
+            </wp:cNvGraphicFramePr>
+            <a:graphic xmlns:a="http://schemas.openxmlformats.org/drawingml/2006/main">
+              <a:graphicData uri="http://schemas.openxmlformats.org/drawingml/2006/picture">
+                <pic:pic xmlns:pic="http://schemas.openxmlformats.org/drawingml/2006/picture">
+                  <pic:nvPicPr>
+                    <pic:cNvPr id="2140321094" name="Picture 2140321094"/>
+                    <pic:cNvPicPr/>
+                  </pic:nvPicPr>
+                  <pic:blipFill>
+                    <a:blip r:embed="rId6" cstate="print">
+                      <a:extLst>
+                        <a:ext uri="{28A0092B-C50C-407E-A947-70E740481C1C}">
+                          <a14:useLocalDpi xmlns:a14="http://schemas.microsoft.com/office/drawing/2010/main" val="0"/>
+                        </a:ext>
+                      </a:extLst>
+                    </a:blip>
+                    <a:stretch>
+                      <a:fillRect/>
+                    </a:stretch>
+                  </pic:blipFill>
+                  <pic:spPr>
+                    <a:xfrm>
+                      <a:off x="0" y="0"/>
+                      <a:ext cx="5943600" cy="3232785"/>
+                    </a:xfrm>
+                    <a:prstGeom prst="rect">
+                      <a:avLst/>
+                    </a:prstGeom>
+                  </pic:spPr>
+                </pic:pic>
+              </a:graphicData>
+            </a:graphic>
+          </wp:inline>
+        </w:drawing>
+      </w:r>
+      <w:r>
+        <w:rPr>
+          <w:rFonts w:ascii="Times New Roman" w:hAnsi="Times New Roman" w:cs="Times New Roman"/>
+        </w:rPr>
+        <w:br/>
+      </w:r>
+    </w:p>
     <w:sectPr>
       <w:pgSz w:w="12240" w:h="15840"/>
       <w:pgMar w:top="1440" w:right="1440" w:bottom="1440" w:left="1440" w:header="720" w:footer="720" w:gutter="0"/>
@@ -235,6 +347,243 @@
     </w:sectPr>
   </w:body>
 </w:document>
+</file>
+
+<file path=word/numbering.xml><?xml version="1.0" encoding="utf-8"?>
+<w:numbering xmlns:wpc="http://schemas.microsoft.com/office/word/2010/wordprocessingCanvas" xmlns:cx="http://schemas.microsoft.com/office/drawing/2014/chartex" xmlns:cx1="http://schemas.microsoft.com/office/drawing/2015/9/8/chartex" xmlns:cx2="http://schemas.microsoft.com/office/drawing/2015/10/21/chartex" xmlns:cx3="http://schemas.microsoft.com/office/drawing/2016/5/9/chartex" xmlns:cx4="http://schemas.microsoft.com/office/drawing/2016/5/10/chartex" xmlns:cx5="http://schemas.microsoft.com/office/drawing/2016/5/11/chartex" xmlns:cx6="http://schemas.microsoft.com/office/drawing/2016/5/12/chartex" xmlns:cx7="http://schemas.microsoft.com/office/drawing/2016/5/13/chartex" xmlns:cx8="http://schemas.microsoft.com/office/drawing/2016/5/14/chartex" xmlns:mc="http://schemas.openxmlformats.org/markup-compatibility/2006" xmlns:m="http://schemas.openxmlformats.org/officeDocument/2006/math" xmlns:aink="http://schemas.microsoft.com/office/drawing/2016/ink" xmlns:am3d="http://schemas.microsoft.com/office/drawing/2017/model3d" xmlns:oel="http://schemas.microsoft.com/office/2019/extlst" xmlns:r="http://schemas.openxmlformats.org/officeDocument/2006/relationships" xmlns:wp14="http://schemas.microsoft.com/office/word/2010/wordprocessingDrawing" xmlns:wp="http://schemas.openxmlformats.org/drawingml/2006/wordprocessingDrawing" xmlns:wpg="http://schemas.microsoft.com/office/word/2010/wordprocessingGroup" xmlns:wpi="http://schemas.microsoft.com/office/word/2010/wordprocessingInk" xmlns:wps="http://schemas.microsoft.com/office/word/2010/wordprocessingShape" xmlns:o="urn:schemas-microsoft-com:office:office" xmlns:v="urn:schemas-microsoft-com:vml" xmlns:w10="urn:schemas-microsoft-com:office:word" xmlns:w="http://schemas.openxmlformats.org/wordprocessingml/2006/main" xmlns:w14="http://schemas.microsoft.com/office/word/2010/wordml" xmlns:w15="http://schemas.microsoft.com/office/word/2012/wordml" xmlns:w16cex="http://schemas.microsoft.com/office/word/2018/wordml/cex" xmlns:w16cid="http://schemas.microsoft.com/office/word/2016/wordml/cid" xmlns:w16="http://schemas.microsoft.com/office/word/2018/wordml" xmlns:w16sdtdh="http://schemas.microsoft.com/office/word/2020/wordml/sdtdatahash" xmlns:w16sdtfl="http://schemas.microsoft.com/office/word/2024/wordml/sdtformatlock" xmlns:w16se="http://schemas.microsoft.com/office/word/2015/wordml/symex" xmlns:w16du="http://schemas.microsoft.com/office/word/2023/wordml/word16du" xmlns:wne="http://schemas.microsoft.com/office/word/2006/wordml" mc:Ignorable="w14 w15 w16se w16cid w16 w16cex w16sdtdh w16sdtfl w16du wp14">
+  <w:abstractNum w:abstractNumId="0" w15:restartNumberingAfterBreak="0">
+    <w:nsid w:val="094303DF"/>
+    <w:multiLevelType w:val="multilevel"/>
+    <w:tmpl w:val="836E9954"/>
+    <w:lvl w:ilvl="0">
+      <w:start w:val="1"/>
+      <w:numFmt w:val="decimal"/>
+      <w:lvlText w:val="%1."/>
+      <w:lvlJc w:val="left"/>
+      <w:pPr>
+        <w:tabs>
+          <w:tab w:val="num" w:pos="720"/>
+        </w:tabs>
+        <w:ind w:left="720" w:hanging="360"/>
+      </w:pPr>
+    </w:lvl>
+    <w:lvl w:ilvl="1" w:tentative="1">
+      <w:start w:val="1"/>
+      <w:numFmt w:val="decimal"/>
+      <w:lvlText w:val="%2."/>
+      <w:lvlJc w:val="left"/>
+      <w:pPr>
+        <w:tabs>
+          <w:tab w:val="num" w:pos="1440"/>
+        </w:tabs>
+        <w:ind w:left="1440" w:hanging="360"/>
+      </w:pPr>
+    </w:lvl>
+    <w:lvl w:ilvl="2" w:tentative="1">
+      <w:start w:val="1"/>
+      <w:numFmt w:val="decimal"/>
+      <w:lvlText w:val="%3."/>
+      <w:lvlJc w:val="left"/>
+      <w:pPr>
+        <w:tabs>
+          <w:tab w:val="num" w:pos="2160"/>
+        </w:tabs>
+        <w:ind w:left="2160" w:hanging="360"/>
+      </w:pPr>
+    </w:lvl>
+    <w:lvl w:ilvl="3" w:tentative="1">
+      <w:start w:val="1"/>
+      <w:numFmt w:val="decimal"/>
+      <w:lvlText w:val="%4."/>
+      <w:lvlJc w:val="left"/>
+      <w:pPr>
+        <w:tabs>
+          <w:tab w:val="num" w:pos="2880"/>
+        </w:tabs>
+        <w:ind w:left="2880" w:hanging="360"/>
+      </w:pPr>
+    </w:lvl>
+    <w:lvl w:ilvl="4" w:tentative="1">
+      <w:start w:val="1"/>
+      <w:numFmt w:val="decimal"/>
+      <w:lvlText w:val="%5."/>
+      <w:lvlJc w:val="left"/>
+      <w:pPr>
+        <w:tabs>
+          <w:tab w:val="num" w:pos="3600"/>
+        </w:tabs>
+        <w:ind w:left="3600" w:hanging="360"/>
+      </w:pPr>
+    </w:lvl>
+    <w:lvl w:ilvl="5" w:tentative="1">
+      <w:start w:val="1"/>
+      <w:numFmt w:val="decimal"/>
+      <w:lvlText w:val="%6."/>
+      <w:lvlJc w:val="left"/>
+      <w:pPr>
+        <w:tabs>
+          <w:tab w:val="num" w:pos="4320"/>
+        </w:tabs>
+        <w:ind w:left="4320" w:hanging="360"/>
+      </w:pPr>
+    </w:lvl>
+    <w:lvl w:ilvl="6" w:tentative="1">
+      <w:start w:val="1"/>
+      <w:numFmt w:val="decimal"/>
+      <w:lvlText w:val="%7."/>
+      <w:lvlJc w:val="left"/>
+      <w:pPr>
+        <w:tabs>
+          <w:tab w:val="num" w:pos="5040"/>
+        </w:tabs>
+        <w:ind w:left="5040" w:hanging="360"/>
+      </w:pPr>
+    </w:lvl>
+    <w:lvl w:ilvl="7" w:tentative="1">
+      <w:start w:val="1"/>
+      <w:numFmt w:val="decimal"/>
+      <w:lvlText w:val="%8."/>
+      <w:lvlJc w:val="left"/>
+      <w:pPr>
+        <w:tabs>
+          <w:tab w:val="num" w:pos="5760"/>
+        </w:tabs>
+        <w:ind w:left="5760" w:hanging="360"/>
+      </w:pPr>
+    </w:lvl>
+    <w:lvl w:ilvl="8" w:tentative="1">
+      <w:start w:val="1"/>
+      <w:numFmt w:val="decimal"/>
+      <w:lvlText w:val="%9."/>
+      <w:lvlJc w:val="left"/>
+      <w:pPr>
+        <w:tabs>
+          <w:tab w:val="num" w:pos="6480"/>
+        </w:tabs>
+        <w:ind w:left="6480" w:hanging="360"/>
+      </w:pPr>
+    </w:lvl>
+  </w:abstractNum>
+  <w:abstractNum w:abstractNumId="1" w15:restartNumberingAfterBreak="0">
+    <w:nsid w:val="51C37606"/>
+    <w:multiLevelType w:val="multilevel"/>
+    <w:tmpl w:val="2764980A"/>
+    <w:lvl w:ilvl="0">
+      <w:start w:val="1"/>
+      <w:numFmt w:val="decimal"/>
+      <w:lvlText w:val="%1."/>
+      <w:lvlJc w:val="left"/>
+      <w:pPr>
+        <w:tabs>
+          <w:tab w:val="num" w:pos="720"/>
+        </w:tabs>
+        <w:ind w:left="720" w:hanging="360"/>
+      </w:pPr>
+    </w:lvl>
+    <w:lvl w:ilvl="1" w:tentative="1">
+      <w:start w:val="1"/>
+      <w:numFmt w:val="decimal"/>
+      <w:lvlText w:val="%2."/>
+      <w:lvlJc w:val="left"/>
+      <w:pPr>
+        <w:tabs>
+          <w:tab w:val="num" w:pos="1440"/>
+        </w:tabs>
+        <w:ind w:left="1440" w:hanging="360"/>
+      </w:pPr>
+    </w:lvl>
+    <w:lvl w:ilvl="2" w:tentative="1">
+      <w:start w:val="1"/>
+      <w:numFmt w:val="decimal"/>
+      <w:lvlText w:val="%3."/>
+      <w:lvlJc w:val="left"/>
+      <w:pPr>
+        <w:tabs>
+          <w:tab w:val="num" w:pos="2160"/>
+        </w:tabs>
+        <w:ind w:left="2160" w:hanging="360"/>
+      </w:pPr>
+    </w:lvl>
+    <w:lvl w:ilvl="3" w:tentative="1">
+      <w:start w:val="1"/>
+      <w:numFmt w:val="decimal"/>
+      <w:lvlText w:val="%4."/>
+      <w:lvlJc w:val="left"/>
+      <w:pPr>
+        <w:tabs>
+          <w:tab w:val="num" w:pos="2880"/>
+        </w:tabs>
+        <w:ind w:left="2880" w:hanging="360"/>
+      </w:pPr>
+    </w:lvl>
+    <w:lvl w:ilvl="4" w:tentative="1">
+      <w:start w:val="1"/>
+      <w:numFmt w:val="decimal"/>
+      <w:lvlText w:val="%5."/>
+      <w:lvlJc w:val="left"/>
+      <w:pPr>
+        <w:tabs>
+          <w:tab w:val="num" w:pos="3600"/>
+        </w:tabs>
+        <w:ind w:left="3600" w:hanging="360"/>
+      </w:pPr>
+    </w:lvl>
+    <w:lvl w:ilvl="5" w:tentative="1">
+      <w:start w:val="1"/>
+      <w:numFmt w:val="decimal"/>
+      <w:lvlText w:val="%6."/>
+      <w:lvlJc w:val="left"/>
+      <w:pPr>
+        <w:tabs>
+          <w:tab w:val="num" w:pos="4320"/>
+        </w:tabs>
+        <w:ind w:left="4320" w:hanging="360"/>
+      </w:pPr>
+    </w:lvl>
+    <w:lvl w:ilvl="6" w:tentative="1">
+      <w:start w:val="1"/>
+      <w:numFmt w:val="decimal"/>
+      <w:lvlText w:val="%7."/>
+      <w:lvlJc w:val="left"/>
+      <w:pPr>
+        <w:tabs>
+          <w:tab w:val="num" w:pos="5040"/>
+        </w:tabs>
+        <w:ind w:left="5040" w:hanging="360"/>
+      </w:pPr>
+    </w:lvl>
+    <w:lvl w:ilvl="7" w:tentative="1">
+      <w:start w:val="1"/>
+      <w:numFmt w:val="decimal"/>
+      <w:lvlText w:val="%8."/>
+      <w:lvlJc w:val="left"/>
+      <w:pPr>
+        <w:tabs>
+          <w:tab w:val="num" w:pos="5760"/>
+        </w:tabs>
+        <w:ind w:left="5760" w:hanging="360"/>
+      </w:pPr>
+    </w:lvl>
+    <w:lvl w:ilvl="8" w:tentative="1">
+      <w:start w:val="1"/>
+      <w:numFmt w:val="decimal"/>
+      <w:lvlText w:val="%9."/>
+      <w:lvlJc w:val="left"/>
+      <w:pPr>
+        <w:tabs>
+          <w:tab w:val="num" w:pos="6480"/>
+        </w:tabs>
+        <w:ind w:left="6480" w:hanging="360"/>
+      </w:pPr>
+    </w:lvl>
+  </w:abstractNum>
+  <w:num w:numId="1" w16cid:durableId="1570576877">
+    <w:abstractNumId w:val="0"/>
+  </w:num>
+  <w:num w:numId="2" w16cid:durableId="861164647">
+    <w:abstractNumId w:val="1"/>
+  </w:num>
+</w:numbering>
 </file>
 
 <file path=word/styles.xml><?xml version="1.0" encoding="utf-8"?>

</xml_diff>